<commit_message>
style(verificacao): atualiza layout do docx para padrão exato da LV anterior
</commit_message>
<xml_diff>
--- a/docs/apresentacao/perguntas-verificacao-etapa-4.docx
+++ b/docs/apresentacao/perguntas-verificacao-etapa-4.docx
@@ -2,1535 +2,1109 @@
 <file path=word/document.xml><?xml version="1.0" encoding="utf-8"?>
 <w:document xmlns:wpc="http://schemas.microsoft.com/office/word/2010/wordprocessingCanvas" xmlns:mo="http://schemas.microsoft.com/office/mac/office/2008/main" xmlns:mc="http://schemas.openxmlformats.org/markup-compatibility/2006" xmlns:mv="urn:schemas-microsoft-com:mac:vml" xmlns:o="urn:schemas-microsoft-com:office:office" xmlns:r="http://schemas.openxmlformats.org/officeDocument/2006/relationships" xmlns:m="http://schemas.openxmlformats.org/officeDocument/2006/math" xmlns:v="urn:schemas-microsoft-com:vml" xmlns:wp14="http://schemas.microsoft.com/office/word/2010/wordprocessingDrawing" xmlns:wp="http://schemas.openxmlformats.org/drawingml/2006/wordprocessingDrawing" xmlns:w10="urn:schemas-microsoft-com:office:word" xmlns:w="http://schemas.openxmlformats.org/wordprocessingml/2006/main" xmlns:w14="http://schemas.microsoft.com/office/word/2010/wordml" xmlns:wpg="http://schemas.microsoft.com/office/word/2010/wordprocessingGroup" xmlns:wpi="http://schemas.microsoft.com/office/word/2010/wordprocessingInk" xmlns:wne="http://schemas.microsoft.com/office/word/2006/wordml" xmlns:wps="http://schemas.microsoft.com/office/word/2010/wordprocessingShape" mc:Ignorable="w14 wp14">
   <w:body>
-    <w:tbl>
-      <w:tblPr>
-        <w:tblW w:type="auto" w:w="0"/>
-        <w:jc w:val="center"/>
-        <w:tblLayout w:type="fixed"/>
-        <w:tblLook w:firstColumn="1" w:firstRow="1" w:lastColumn="0" w:lastRow="0" w:noHBand="0" w:noVBand="1" w:val="04A0"/>
-      </w:tblPr>
-      <w:tblGrid>
-        <w:gridCol w:w="4982"/>
-        <w:gridCol w:w="4982"/>
-      </w:tblGrid>
-      <w:tr>
-        <w:tc>
-          <w:tcPr>
-            <w:tcW w:type="dxa" w:w="4752"/>
-            <w:tcBorders>
-              <w:bottom w:sz="6" w:val="single" w:color="1F497D" w:space="0"/>
-            </w:tcBorders>
-          </w:tcPr>
-          <w:p>
-            <w:pPr>
-              <w:spacing w:after="40" w:line="276" w:lineRule="auto"/>
-            </w:pPr>
-            <w:r>
-              <w:rPr>
-                <w:b/>
-                <w:color w:val="0F2042"/>
-                <w:sz w:val="21"/>
-              </w:rPr>
-              <w:t>Universidade de Brasília</w:t>
-              <w:br/>
-              <w:t>Faculdade UnB Gama – FGA</w:t>
-            </w:r>
-          </w:p>
-        </w:tc>
-        <w:tc>
-          <w:tcPr>
-            <w:tcW w:type="dxa" w:w="5184"/>
-            <w:tcBorders>
-              <w:bottom w:sz="6" w:val="single" w:color="1F497D" w:space="0"/>
-            </w:tcBorders>
-          </w:tcPr>
-          <w:p>
-            <w:pPr>
-              <w:spacing w:after="40" w:line="276" w:lineRule="auto"/>
-              <w:jc w:val="right"/>
-            </w:pPr>
-            <w:r>
-              <w:rPr>
-                <w:b/>
-                <w:color w:val="0F2042"/>
-                <w:sz w:val="21"/>
-              </w:rPr>
-              <w:t>Interação Humano-Computador</w:t>
-              <w:br/>
-              <w:t>Prof. Dr. André Barros de Sales</w:t>
-            </w:r>
-          </w:p>
-        </w:tc>
-      </w:tr>
-      <w:tr>
-        <w:tc>
-          <w:tcPr>
-            <w:tcW w:type="dxa" w:w="4752"/>
-            <w:tcBorders>
-              <w:bottom w:sz="6" w:val="single" w:color="1F497D" w:space="0"/>
-            </w:tcBorders>
-          </w:tcPr>
-          <w:p>
-            <w:pPr>
-              <w:spacing w:before="80" w:after="40"/>
-            </w:pPr>
-            <w:r>
-              <w:rPr>
-                <w:b/>
-                <w:sz w:val="20"/>
-              </w:rPr>
-              <w:t xml:space="preserve">Avaliador: </w:t>
-            </w:r>
-            <w:r>
-              <w:rPr>
-                <w:sz w:val="20"/>
-              </w:rPr>
-              <w:t>Daniel Batista — Matrícula: 231011201</w:t>
-            </w:r>
-          </w:p>
-        </w:tc>
-        <w:tc>
-          <w:tcPr>
-            <w:tcW w:type="dxa" w:w="5184"/>
-            <w:tcBorders>
-              <w:bottom w:sz="6" w:val="single" w:color="1F497D" w:space="0"/>
-            </w:tcBorders>
-          </w:tcPr>
-          <w:p>
-            <w:pPr>
-              <w:spacing w:before="80" w:after="40"/>
-              <w:jc w:val="right"/>
-            </w:pPr>
-            <w:r>
-              <w:rPr>
-                <w:b/>
-                <w:sz w:val="20"/>
-              </w:rPr>
-              <w:t>Grupo 07 — PCI Concursos</w:t>
-              <w:br/>
-              <w:t>Etapa 4 (Planejamento e Relato)</w:t>
-            </w:r>
-          </w:p>
-        </w:tc>
-      </w:tr>
-    </w:tbl>
     <w:p>
       <w:pPr>
-        <w:spacing w:after="200"/>
+        <w:spacing w:before="0" w:after="0" w:line="276" w:lineRule="auto"/>
+        <w:jc w:val="left"/>
+      </w:pPr>
+      <w:r>
+        <w:rPr>
+          <w:rFonts w:ascii="Arial" w:hAnsi="Arial"/>
+          <w:sz w:val="22"/>
+        </w:rPr>
+        <w:t>Universidade de Brasília</w:t>
+        <w:br/>
+        <w:t>Faculdade UnB Gama - FGA</w:t>
+        <w:br/>
+        <w:t>Professor: André Barros de Sales   Disciplina: IHC</w:t>
+        <w:br/>
+        <w:t>Matrícula: 231011201   Nome: Daniel Batista</w:t>
+      </w:r>
+    </w:p>
+    <w:p>
+      <w:pPr>
+        <w:spacing w:before="0" w:after="80"/>
       </w:pPr>
     </w:p>
     <w:p>
       <w:pPr>
-        <w:spacing w:after="80"/>
+        <w:spacing w:before="0" w:after="280"/>
         <w:jc w:val="center"/>
       </w:pPr>
       <w:r>
         <w:rPr>
+          <w:rFonts w:ascii="Arial" w:hAnsi="Arial"/>
           <w:b/>
-          <w:color w:val="0F2042"/>
-          <w:sz w:val="28"/>
+          <w:sz w:val="24"/>
         </w:rPr>
         <w:t>LISTA DE VERIFICAÇÃO — ETAPA 4</w:t>
-        <w:br/>
-        <w:t>AVALIAÇÃO DOS ARTEFATOS DE PLANEJAMENTO</w:t>
-      </w:r>
-    </w:p>
-    <w:p>
-      <w:pPr>
-        <w:spacing w:after="320"/>
-        <w:jc w:val="center"/>
-      </w:pPr>
-      <w:r>
-        <w:rPr>
-          <w:i/>
-          <w:color w:val="57606A"/>
-          <w:sz w:val="20"/>
-        </w:rPr>
-        <w:t>Instrumento de Suporte à Inspeção e Gravação da Autoavaliação e Avaliação Cruzada</w:t>
-        <w:br/>
-        <w:t>(10 Itens de Governança + 13 Itens do Docente + 4 Itens Formulados pela Equipe = 27 Itens)</w:t>
       </w:r>
     </w:p>
     <w:p>
       <w:pPr>
         <w:keepNext/>
-        <w:spacing w:before="280" w:after="120"/>
+        <w:spacing w:before="240" w:after="120"/>
+        <w:jc w:val="left"/>
       </w:pPr>
       <w:r>
         <w:rPr>
+          <w:rFonts w:ascii="Arial" w:hAnsi="Arial"/>
           <w:b/>
-          <w:color w:val="0F2042"/>
-          <w:sz w:val="24"/>
+          <w:sz w:val="22"/>
         </w:rPr>
-        <w:t>BLOCO 1 — ITENS DE DESENVOLVIMENTO DO PROJETO (10 ITENS)</w:t>
+        <w:t>ITENS DE DESENVOLVIMENTO DO PROJETO</w:t>
       </w:r>
     </w:p>
     <w:p>
       <w:pPr>
         <w:keepNext/>
-        <w:spacing w:before="160" w:after="40"/>
+        <w:spacing w:before="80" w:after="80"/>
+        <w:jc w:val="left"/>
       </w:pPr>
       <w:r>
         <w:rPr>
+          <w:rFonts w:ascii="Arial" w:hAnsi="Arial"/>
           <w:b/>
           <w:sz w:val="21"/>
         </w:rPr>
-        <w:t xml:space="preserve">1) </w:t>
-      </w:r>
-      <w:r>
-        <w:rPr>
-          <w:sz w:val="21"/>
-        </w:rPr>
-        <w:t>O GitHub Pages do projeto possui o histórico de versão padronizado?</w:t>
+        <w:t>1) O GitHub Pages do projeto possui o histórico de versão padronizado?</w:t>
       </w:r>
     </w:p>
     <w:p>
       <w:pPr>
         <w:keepNext/>
-        <w:spacing w:before="40" w:after="40"/>
+        <w:spacing w:before="0" w:after="80"/>
+        <w:jc w:val="center"/>
       </w:pPr>
       <w:r>
         <w:rPr>
-          <w:b/>
-          <w:color w:val="333333"/>
+          <w:rFonts w:ascii="Arial" w:hAnsi="Arial"/>
           <w:sz w:val="20"/>
         </w:rPr>
-        <w:t xml:space="preserve">   (   ) Sim          (   ) Não          (   ) Incompleto</w:t>
+        <w:t>(  ) Conforme          (  ) Não conforme          (  ) Não se aplica</w:t>
       </w:r>
     </w:p>
     <w:p>
       <w:pPr>
-        <w:spacing w:before="20" w:after="120"/>
+        <w:spacing w:before="0" w:after="280"/>
+        <w:jc w:val="left"/>
       </w:pPr>
       <w:r>
         <w:rPr>
-          <w:b/>
-          <w:color w:val="57606A"/>
+          <w:rFonts w:ascii="Arial" w:hAnsi="Arial"/>
           <w:sz w:val="19"/>
         </w:rPr>
-        <w:t xml:space="preserve">   Fonte: </w:t>
-      </w:r>
-      <w:r>
-        <w:rPr>
-          <w:i/>
-          <w:color w:val="57606A"/>
-          <w:sz w:val="19"/>
-        </w:rPr>
-        <w:t>SALES, André Barros de. Plano de ensino FIHC 022026 – Turma 01. Brasília: FCTE/UnB, 2026.</w:t>
+        <w:t>Fonte: SALES, André Barros de. Plano de ensino FIHC 022026 – Turma 01. Brasília: FCTE/UnB, 2026.</w:t>
       </w:r>
     </w:p>
     <w:p>
       <w:pPr>
         <w:keepNext/>
-        <w:spacing w:before="160" w:after="40"/>
+        <w:spacing w:before="80" w:after="80"/>
+        <w:jc w:val="left"/>
       </w:pPr>
       <w:r>
         <w:rPr>
+          <w:rFonts w:ascii="Arial" w:hAnsi="Arial"/>
           <w:b/>
           <w:sz w:val="21"/>
         </w:rPr>
-        <w:t xml:space="preserve">2) </w:t>
-      </w:r>
-      <w:r>
-        <w:rPr>
-          <w:sz w:val="21"/>
-        </w:rPr>
-        <w:t>O GitHub Pages do projeto indica o(s) autor(es) e o(s) revisor(es) para cada artefato?</w:t>
+        <w:t>2) O GitHub Pages do projeto indica o(s) autor(es) e o(s) revisor(es) para cada artefato?</w:t>
       </w:r>
     </w:p>
     <w:p>
       <w:pPr>
         <w:keepNext/>
-        <w:spacing w:before="40" w:after="40"/>
+        <w:spacing w:before="0" w:after="80"/>
+        <w:jc w:val="center"/>
       </w:pPr>
       <w:r>
         <w:rPr>
-          <w:b/>
-          <w:color w:val="333333"/>
+          <w:rFonts w:ascii="Arial" w:hAnsi="Arial"/>
           <w:sz w:val="20"/>
         </w:rPr>
-        <w:t xml:space="preserve">   (   ) Sim          (   ) Não          (   ) Incompleto</w:t>
+        <w:t>(  ) Conforme          (  ) Não conforme          (  ) Não se aplica</w:t>
       </w:r>
     </w:p>
     <w:p>
       <w:pPr>
-        <w:spacing w:before="20" w:after="120"/>
+        <w:spacing w:before="0" w:after="280"/>
+        <w:jc w:val="left"/>
       </w:pPr>
       <w:r>
         <w:rPr>
-          <w:b/>
-          <w:color w:val="57606A"/>
+          <w:rFonts w:ascii="Arial" w:hAnsi="Arial"/>
           <w:sz w:val="19"/>
         </w:rPr>
-        <w:t xml:space="preserve">   Fonte: </w:t>
-      </w:r>
-      <w:r>
-        <w:rPr>
-          <w:i/>
-          <w:color w:val="57606A"/>
-          <w:sz w:val="19"/>
-        </w:rPr>
-        <w:t>SALES, André Barros de. Plano de ensino FIHC 022026 – Turma 01. Brasília: FCTE/UnB, 2026.</w:t>
+        <w:t>Fonte: SALES, André Barros de. Plano de ensino FIHC 022026 – Turma 01. Brasília: FCTE/UnB, 2026.</w:t>
       </w:r>
     </w:p>
     <w:p>
       <w:pPr>
         <w:keepNext/>
-        <w:spacing w:before="160" w:after="40"/>
+        <w:spacing w:before="80" w:after="80"/>
+        <w:jc w:val="left"/>
       </w:pPr>
       <w:r>
         <w:rPr>
+          <w:rFonts w:ascii="Arial" w:hAnsi="Arial"/>
           <w:b/>
           <w:sz w:val="21"/>
         </w:rPr>
-        <w:t xml:space="preserve">3) </w:t>
-      </w:r>
-      <w:r>
-        <w:rPr>
-          <w:sz w:val="21"/>
-        </w:rPr>
-        <w:t>O GitHub Pages do projeto possui referências bibliográficas e/ou bibliografia em todos os artefatos?</w:t>
+        <w:t>3) O GitHub Pages do projeto possui referências bibliográficas e/ou bibliografia em todos os artefatos?</w:t>
       </w:r>
     </w:p>
     <w:p>
       <w:pPr>
         <w:keepNext/>
-        <w:spacing w:before="40" w:after="40"/>
+        <w:spacing w:before="0" w:after="80"/>
+        <w:jc w:val="center"/>
       </w:pPr>
       <w:r>
         <w:rPr>
-          <w:b/>
-          <w:color w:val="333333"/>
+          <w:rFonts w:ascii="Arial" w:hAnsi="Arial"/>
           <w:sz w:val="20"/>
         </w:rPr>
-        <w:t xml:space="preserve">   (   ) Sim          (   ) Não          (   ) Incompleto</w:t>
+        <w:t>(  ) Conforme          (  ) Não conforme          (  ) Não se aplica</w:t>
       </w:r>
     </w:p>
     <w:p>
       <w:pPr>
-        <w:spacing w:before="20" w:after="120"/>
+        <w:spacing w:before="0" w:after="280"/>
+        <w:jc w:val="left"/>
       </w:pPr>
       <w:r>
         <w:rPr>
-          <w:b/>
-          <w:color w:val="57606A"/>
+          <w:rFonts w:ascii="Arial" w:hAnsi="Arial"/>
           <w:sz w:val="19"/>
         </w:rPr>
-        <w:t xml:space="preserve">   Fonte: </w:t>
-      </w:r>
-      <w:r>
-        <w:rPr>
-          <w:i/>
-          <w:color w:val="57606A"/>
-          <w:sz w:val="19"/>
-        </w:rPr>
-        <w:t>SALES, André Barros de. Plano de ensino FIHC 022026 – Turma 01. Brasília: FCTE/UnB, 2026.</w:t>
+        <w:t>Fonte: SALES, André Barros de. Plano de ensino FIHC 022026 – Turma 01. Brasília: FCTE/UnB, 2026.</w:t>
       </w:r>
     </w:p>
     <w:p>
       <w:pPr>
         <w:keepNext/>
-        <w:spacing w:before="160" w:after="40"/>
+        <w:spacing w:before="80" w:after="80"/>
+        <w:jc w:val="left"/>
       </w:pPr>
       <w:r>
         <w:rPr>
+          <w:rFonts w:ascii="Arial" w:hAnsi="Arial"/>
           <w:b/>
           <w:sz w:val="21"/>
         </w:rPr>
-        <w:t xml:space="preserve">4) </w:t>
-      </w:r>
-      <w:r>
-        <w:rPr>
-          <w:sz w:val="21"/>
-        </w:rPr>
-        <w:t>No GitHub Pages do projeto, as tabelas e imagens possuem legenda e fonte e são chamadas dentro do texto?</w:t>
+        <w:t>4) No GitHub Pages do projeto, as tabelas e imagens possuem legenda e fonte e são chamadas dentro do texto?</w:t>
       </w:r>
     </w:p>
     <w:p>
       <w:pPr>
         <w:keepNext/>
-        <w:spacing w:before="40" w:after="40"/>
+        <w:spacing w:before="0" w:after="80"/>
+        <w:jc w:val="center"/>
       </w:pPr>
       <w:r>
         <w:rPr>
-          <w:b/>
-          <w:color w:val="333333"/>
+          <w:rFonts w:ascii="Arial" w:hAnsi="Arial"/>
           <w:sz w:val="20"/>
         </w:rPr>
-        <w:t xml:space="preserve">   (   ) Sim          (   ) Não          (   ) Incompleto</w:t>
+        <w:t>(  ) Conforme          (  ) Não conforme          (  ) Não se aplica</w:t>
       </w:r>
     </w:p>
     <w:p>
       <w:pPr>
-        <w:spacing w:before="20" w:after="120"/>
+        <w:spacing w:before="0" w:after="280"/>
+        <w:jc w:val="left"/>
       </w:pPr>
       <w:r>
         <w:rPr>
-          <w:b/>
-          <w:color w:val="57606A"/>
+          <w:rFonts w:ascii="Arial" w:hAnsi="Arial"/>
           <w:sz w:val="19"/>
         </w:rPr>
-        <w:t xml:space="preserve">   Fonte: </w:t>
-      </w:r>
-      <w:r>
-        <w:rPr>
-          <w:i/>
-          <w:color w:val="57606A"/>
-          <w:sz w:val="19"/>
-        </w:rPr>
-        <w:t>SALES, André Barros de. Plano de ensino FIHC 022026 – Turma 01. Brasília: FCTE/UnB, 2026.</w:t>
+        <w:t>Fonte: SALES, André Barros de. Plano de ensino FIHC 022026 – Turma 01. Brasília: FCTE/UnB, 2026.</w:t>
       </w:r>
     </w:p>
     <w:p>
       <w:pPr>
         <w:keepNext/>
-        <w:spacing w:before="160" w:after="40"/>
+        <w:spacing w:before="80" w:after="80"/>
+        <w:jc w:val="left"/>
       </w:pPr>
       <w:r>
         <w:rPr>
+          <w:rFonts w:ascii="Arial" w:hAnsi="Arial"/>
           <w:b/>
           <w:sz w:val="21"/>
         </w:rPr>
-        <w:t xml:space="preserve">5) </w:t>
-      </w:r>
-      <w:r>
-        <w:rPr>
-          <w:sz w:val="21"/>
-        </w:rPr>
-        <w:t>O GitHub Pages do projeto possui um texto fazendo uma introdução dos artefatos?</w:t>
+        <w:t>5) O GitHub Pages do projeto possui um texto fazendo uma introdução dos artefatos?</w:t>
       </w:r>
     </w:p>
     <w:p>
       <w:pPr>
         <w:keepNext/>
-        <w:spacing w:before="40" w:after="40"/>
+        <w:spacing w:before="0" w:after="80"/>
+        <w:jc w:val="center"/>
       </w:pPr>
       <w:r>
         <w:rPr>
-          <w:b/>
-          <w:color w:val="333333"/>
+          <w:rFonts w:ascii="Arial" w:hAnsi="Arial"/>
           <w:sz w:val="20"/>
         </w:rPr>
-        <w:t xml:space="preserve">   (   ) Sim          (   ) Não          (   ) Incompleto</w:t>
+        <w:t>(  ) Conforme          (  ) Não conforme          (  ) Não se aplica</w:t>
       </w:r>
     </w:p>
     <w:p>
       <w:pPr>
-        <w:spacing w:before="20" w:after="120"/>
+        <w:spacing w:before="0" w:after="280"/>
+        <w:jc w:val="left"/>
       </w:pPr>
       <w:r>
         <w:rPr>
-          <w:b/>
-          <w:color w:val="57606A"/>
+          <w:rFonts w:ascii="Arial" w:hAnsi="Arial"/>
           <w:sz w:val="19"/>
         </w:rPr>
-        <w:t xml:space="preserve">   Fonte: </w:t>
-      </w:r>
-      <w:r>
-        <w:rPr>
-          <w:i/>
-          <w:color w:val="57606A"/>
-          <w:sz w:val="19"/>
-        </w:rPr>
-        <w:t>SALES, André Barros de. Plano de ensino FIHC 022026 – Turma 01. Brasília: FCTE/UnB, 2026.</w:t>
+        <w:t>Fonte: SALES, André Barros de. Plano de ensino FIHC 022026 – Turma 01. Brasília: FCTE/UnB, 2026.</w:t>
       </w:r>
     </w:p>
     <w:p>
       <w:pPr>
         <w:keepNext/>
-        <w:spacing w:before="160" w:after="40"/>
+        <w:spacing w:before="80" w:after="80"/>
+        <w:jc w:val="left"/>
       </w:pPr>
       <w:r>
         <w:rPr>
+          <w:rFonts w:ascii="Arial" w:hAnsi="Arial"/>
           <w:b/>
           <w:sz w:val="21"/>
         </w:rPr>
-        <w:t xml:space="preserve">6) </w:t>
-      </w:r>
-      <w:r>
-        <w:rPr>
-          <w:sz w:val="21"/>
-        </w:rPr>
-        <w:t>O GitHub Pages do projeto possui o cronograma executado, indicando quem realizou cada artefato ou atividade e as datas de início e fim?</w:t>
+        <w:t>6) O GitHub Pages do projeto possui o cronograma executado, indicando quem realizou cada artefato ou atividade e as datas de início e fim?</w:t>
       </w:r>
     </w:p>
     <w:p>
       <w:pPr>
         <w:keepNext/>
-        <w:spacing w:before="40" w:after="40"/>
+        <w:spacing w:before="0" w:after="80"/>
+        <w:jc w:val="center"/>
       </w:pPr>
       <w:r>
         <w:rPr>
-          <w:b/>
-          <w:color w:val="333333"/>
+          <w:rFonts w:ascii="Arial" w:hAnsi="Arial"/>
           <w:sz w:val="20"/>
         </w:rPr>
-        <w:t xml:space="preserve">   (   ) Sim          (   ) Não          (   ) Incompleto</w:t>
+        <w:t>(  ) Conforme          (  ) Não conforme          (  ) Não se aplica</w:t>
       </w:r>
     </w:p>
     <w:p>
       <w:pPr>
-        <w:spacing w:before="20" w:after="120"/>
+        <w:spacing w:before="0" w:after="280"/>
+        <w:jc w:val="left"/>
       </w:pPr>
       <w:r>
         <w:rPr>
-          <w:b/>
-          <w:color w:val="57606A"/>
+          <w:rFonts w:ascii="Arial" w:hAnsi="Arial"/>
           <w:sz w:val="19"/>
         </w:rPr>
-        <w:t xml:space="preserve">   Fonte: </w:t>
-      </w:r>
-      <w:r>
-        <w:rPr>
-          <w:i/>
-          <w:color w:val="57606A"/>
-          <w:sz w:val="19"/>
-        </w:rPr>
-        <w:t>SALES, André Barros de. Plano de ensino FIHC 022026 – Turma 01. Brasília: FCTE/UnB, 2026.</w:t>
+        <w:t>Fonte: SALES, André Barros de. Plano de ensino FIHC 022026 – Turma 01. Brasília: FCTE/UnB, 2026.</w:t>
       </w:r>
     </w:p>
     <w:p>
       <w:pPr>
         <w:keepNext/>
-        <w:spacing w:before="160" w:after="40"/>
+        <w:spacing w:before="80" w:after="80"/>
+        <w:jc w:val="left"/>
       </w:pPr>
       <w:r>
         <w:rPr>
+          <w:rFonts w:ascii="Arial" w:hAnsi="Arial"/>
           <w:b/>
           <w:sz w:val="21"/>
         </w:rPr>
-        <w:t xml:space="preserve">7) </w:t>
-      </w:r>
-      <w:r>
-        <w:rPr>
-          <w:sz w:val="21"/>
-        </w:rPr>
-        <w:t>O GitHub Pages do projeto possui ata(s) da(s) reunião(ões), com data, horário de início e fim, participantes, objetivo e atividades definidas?</w:t>
+        <w:t>7) O GitHub Pages do projeto possui ata(s) da(s) reunião(ões), com data, horário de início e fim, participantes, objetivo e atividades definidas?</w:t>
       </w:r>
     </w:p>
     <w:p>
       <w:pPr>
         <w:keepNext/>
-        <w:spacing w:before="40" w:after="40"/>
+        <w:spacing w:before="0" w:after="80"/>
+        <w:jc w:val="center"/>
       </w:pPr>
       <w:r>
         <w:rPr>
-          <w:b/>
-          <w:color w:val="333333"/>
+          <w:rFonts w:ascii="Arial" w:hAnsi="Arial"/>
           <w:sz w:val="20"/>
         </w:rPr>
-        <w:t xml:space="preserve">   (   ) Sim          (   ) Não          (   ) Incompleto</w:t>
+        <w:t>(  ) Conforme          (  ) Não conforme          (  ) Não se aplica</w:t>
       </w:r>
     </w:p>
     <w:p>
       <w:pPr>
-        <w:spacing w:before="20" w:after="120"/>
+        <w:spacing w:before="0" w:after="280"/>
+        <w:jc w:val="left"/>
       </w:pPr>
       <w:r>
         <w:rPr>
-          <w:b/>
-          <w:color w:val="57606A"/>
+          <w:rFonts w:ascii="Arial" w:hAnsi="Arial"/>
           <w:sz w:val="19"/>
         </w:rPr>
-        <w:t xml:space="preserve">   Fonte: </w:t>
-      </w:r>
-      <w:r>
-        <w:rPr>
-          <w:i/>
-          <w:color w:val="57606A"/>
-          <w:sz w:val="19"/>
-        </w:rPr>
-        <w:t>SALES, André Barros de. Plano de ensino FIHC 022026 – Turma 01. Brasília: FCTE/UnB, 2026.</w:t>
+        <w:t>Fonte: SALES, André Barros de. Plano de ensino FIHC 022026 – Turma 01. Brasília: FCTE/UnB, 2026.</w:t>
       </w:r>
     </w:p>
     <w:p>
       <w:pPr>
         <w:keepNext/>
-        <w:spacing w:before="160" w:after="40"/>
+        <w:spacing w:before="80" w:after="80"/>
+        <w:jc w:val="left"/>
       </w:pPr>
       <w:r>
         <w:rPr>
+          <w:rFonts w:ascii="Arial" w:hAnsi="Arial"/>
           <w:b/>
           <w:sz w:val="21"/>
         </w:rPr>
-        <w:t xml:space="preserve">8) </w:t>
-      </w:r>
-      <w:r>
-        <w:rPr>
-          <w:sz w:val="21"/>
-        </w:rPr>
-        <w:t>O GitHub Pages do projeto possui a gravação da reunião do grupo?</w:t>
+        <w:t>8) O GitHub Pages do projeto possui a gravação da reunião do grupo?</w:t>
       </w:r>
     </w:p>
     <w:p>
       <w:pPr>
         <w:keepNext/>
-        <w:spacing w:before="40" w:after="40"/>
+        <w:spacing w:before="0" w:after="80"/>
+        <w:jc w:val="center"/>
       </w:pPr>
       <w:r>
         <w:rPr>
-          <w:b/>
-          <w:color w:val="333333"/>
+          <w:rFonts w:ascii="Arial" w:hAnsi="Arial"/>
           <w:sz w:val="20"/>
         </w:rPr>
-        <w:t xml:space="preserve">   (   ) Sim          (   ) Não          (   ) Incompleto</w:t>
+        <w:t>(  ) Conforme          (  ) Não conforme          (  ) Não se aplica</w:t>
       </w:r>
     </w:p>
     <w:p>
       <w:pPr>
-        <w:spacing w:before="20" w:after="120"/>
+        <w:spacing w:before="0" w:after="280"/>
+        <w:jc w:val="left"/>
       </w:pPr>
       <w:r>
         <w:rPr>
-          <w:b/>
-          <w:color w:val="57606A"/>
+          <w:rFonts w:ascii="Arial" w:hAnsi="Arial"/>
           <w:sz w:val="19"/>
         </w:rPr>
-        <w:t xml:space="preserve">   Fonte: </w:t>
-      </w:r>
-      <w:r>
-        <w:rPr>
-          <w:i/>
-          <w:color w:val="57606A"/>
-          <w:sz w:val="19"/>
-        </w:rPr>
-        <w:t>SALES, André Barros de. Plano de ensino FIHC 022026 – Turma 01. Brasília: FCTE/UnB, 2026.</w:t>
+        <w:t>Fonte: SALES, André Barros de. Plano de ensino FIHC 022026 – Turma 01. Brasília: FCTE/UnB, 2026.</w:t>
       </w:r>
     </w:p>
     <w:p>
       <w:pPr>
         <w:keepNext/>
-        <w:spacing w:before="160" w:after="40"/>
+        <w:spacing w:before="80" w:after="80"/>
+        <w:jc w:val="left"/>
       </w:pPr>
       <w:r>
         <w:rPr>
+          <w:rFonts w:ascii="Arial" w:hAnsi="Arial"/>
           <w:b/>
           <w:sz w:val="21"/>
         </w:rPr>
-        <w:t xml:space="preserve">9) </w:t>
-      </w:r>
-      <w:r>
-        <w:rPr>
-          <w:sz w:val="21"/>
-        </w:rPr>
-        <w:t>O GitHub Pages do projeto possui vídeo de apresentação publicado na categoria "não listado" no YouTube?</w:t>
+        <w:t>9) O GitHub Pages do projeto possui vídeo de apresentação publicado na categoria "não listado" no YouTube?</w:t>
       </w:r>
     </w:p>
     <w:p>
       <w:pPr>
         <w:keepNext/>
-        <w:spacing w:before="40" w:after="40"/>
+        <w:spacing w:before="0" w:after="80"/>
+        <w:jc w:val="center"/>
       </w:pPr>
       <w:r>
         <w:rPr>
-          <w:b/>
-          <w:color w:val="333333"/>
+          <w:rFonts w:ascii="Arial" w:hAnsi="Arial"/>
           <w:sz w:val="20"/>
         </w:rPr>
-        <w:t xml:space="preserve">   (   ) Sim          (   ) Não          (   ) Incompleto</w:t>
+        <w:t>(  ) Conforme          (  ) Não conforme          (  ) Não se aplica</w:t>
       </w:r>
     </w:p>
     <w:p>
       <w:pPr>
-        <w:spacing w:before="20" w:after="120"/>
+        <w:spacing w:before="0" w:after="280"/>
+        <w:jc w:val="left"/>
       </w:pPr>
       <w:r>
         <w:rPr>
-          <w:b/>
-          <w:color w:val="57606A"/>
+          <w:rFonts w:ascii="Arial" w:hAnsi="Arial"/>
           <w:sz w:val="19"/>
         </w:rPr>
-        <w:t xml:space="preserve">   Fonte: </w:t>
-      </w:r>
-      <w:r>
-        <w:rPr>
-          <w:i/>
-          <w:color w:val="57606A"/>
-          <w:sz w:val="19"/>
-        </w:rPr>
-        <w:t>SALES, André Barros de. Plano de ensino FIHC 022026 – Turma 01. Brasília: FCTE/UnB, 2026.</w:t>
+        <w:t>Fonte: SALES, André Barros de. Plano de ensino FIHC 022026 – Turma 01. Brasília: FCTE/UnB, 2026.</w:t>
       </w:r>
     </w:p>
     <w:p>
       <w:pPr>
         <w:keepNext/>
-        <w:spacing w:before="160" w:after="40"/>
+        <w:spacing w:before="80" w:after="80"/>
+        <w:jc w:val="left"/>
       </w:pPr>
       <w:r>
         <w:rPr>
+          <w:rFonts w:ascii="Arial" w:hAnsi="Arial"/>
           <w:b/>
           <w:sz w:val="21"/>
         </w:rPr>
-        <w:t xml:space="preserve">10) </w:t>
-      </w:r>
-      <w:r>
-        <w:rPr>
-          <w:sz w:val="21"/>
-        </w:rPr>
-        <w:t>O GitHub Pages do projeto possui tabela de contribuição no início do artefato, com o nome de todos os integrantes?</w:t>
+        <w:t>10) O GitHub Pages do projeto possui tabela de contribuição no início do artefato, com o nome de todos os integrantes?</w:t>
       </w:r>
     </w:p>
     <w:p>
       <w:pPr>
         <w:keepNext/>
-        <w:spacing w:before="40" w:after="40"/>
+        <w:spacing w:before="0" w:after="80"/>
+        <w:jc w:val="center"/>
       </w:pPr>
       <w:r>
         <w:rPr>
-          <w:b/>
-          <w:color w:val="333333"/>
+          <w:rFonts w:ascii="Arial" w:hAnsi="Arial"/>
           <w:sz w:val="20"/>
         </w:rPr>
-        <w:t xml:space="preserve">   (   ) Sim          (   ) Não          (   ) Incompleto</w:t>
+        <w:t>(  ) Conforme          (  ) Não conforme          (  ) Não se aplica</w:t>
       </w:r>
     </w:p>
     <w:p>
       <w:pPr>
-        <w:spacing w:before="20" w:after="120"/>
+        <w:spacing w:before="0" w:after="280"/>
+        <w:jc w:val="left"/>
       </w:pPr>
       <w:r>
         <w:rPr>
-          <w:b/>
-          <w:color w:val="57606A"/>
+          <w:rFonts w:ascii="Arial" w:hAnsi="Arial"/>
           <w:sz w:val="19"/>
         </w:rPr>
-        <w:t xml:space="preserve">   Fonte: </w:t>
-      </w:r>
-      <w:r>
-        <w:rPr>
-          <w:i/>
-          <w:color w:val="57606A"/>
-          <w:sz w:val="19"/>
-        </w:rPr>
-        <w:t>SALES, André Barros de. Plano de ensino FIHC 022026 – Turma 01. Brasília: FCTE/UnB, 2026.</w:t>
+        <w:t>Fonte: SALES, André Barros de. Plano de ensino FIHC 022026 – Turma 01. Brasília: FCTE/UnB, 2026.</w:t>
       </w:r>
     </w:p>
     <w:p>
       <w:pPr>
         <w:keepNext/>
-        <w:spacing w:before="280" w:after="120"/>
+        <w:spacing w:before="240" w:after="120"/>
+        <w:jc w:val="left"/>
       </w:pPr>
       <w:r>
         <w:rPr>
+          <w:rFonts w:ascii="Arial" w:hAnsi="Arial"/>
           <w:b/>
-          <w:color w:val="0F2042"/>
-          <w:sz w:val="24"/>
+          <w:sz w:val="22"/>
         </w:rPr>
-        <w:t>BLOCO 2 — ITENS DE CONTEÚDO DA DISCIPLINA (13 ITENS DO PROFESSOR)</w:t>
+        <w:t>ITENS DE CONTEÚDO DA DISCIPLINA</w:t>
       </w:r>
     </w:p>
     <w:p>
       <w:pPr>
         <w:keepNext/>
-        <w:spacing w:before="160" w:after="40"/>
+        <w:spacing w:before="80" w:after="80"/>
+        <w:jc w:val="left"/>
       </w:pPr>
       <w:r>
         <w:rPr>
+          <w:rFonts w:ascii="Arial" w:hAnsi="Arial"/>
           <w:b/>
           <w:sz w:val="21"/>
         </w:rPr>
-        <w:t xml:space="preserve">11) </w:t>
-      </w:r>
-      <w:r>
-        <w:rPr>
-          <w:sz w:val="21"/>
-        </w:rPr>
-        <w:t>O GitHub Pages possui os artefatos: Planejamento da Avaliação do Storyboard e da Análise de tarefas, e o Planejamento do Relato dos Resultados da avaliação do Storyboard e da Análise de tarefas?</w:t>
+        <w:t>11) O GitHub Pages possui os artefatos: Planejamento da Avaliação do Storyboard e da Análise de Tarefas, e o Planejamento do Relato dos Resultados da avaliação do Storyboard e da Análise de Tarefas?</w:t>
       </w:r>
     </w:p>
     <w:p>
       <w:pPr>
         <w:keepNext/>
-        <w:spacing w:before="40" w:after="40"/>
+        <w:spacing w:before="0" w:after="80"/>
+        <w:jc w:val="center"/>
       </w:pPr>
       <w:r>
         <w:rPr>
-          <w:b/>
-          <w:color w:val="333333"/>
+          <w:rFonts w:ascii="Arial" w:hAnsi="Arial"/>
           <w:sz w:val="20"/>
         </w:rPr>
-        <w:t xml:space="preserve">   (   ) Sim          (   ) Não          (   ) Incompleto</w:t>
+        <w:t>(  ) Conforme          (  ) Não conforme          (  ) Não se aplica</w:t>
       </w:r>
     </w:p>
     <w:p>
       <w:pPr>
-        <w:spacing w:before="20" w:after="120"/>
+        <w:spacing w:before="0" w:after="280"/>
+        <w:jc w:val="left"/>
       </w:pPr>
       <w:r>
         <w:rPr>
-          <w:b/>
-          <w:color w:val="57606A"/>
+          <w:rFonts w:ascii="Arial" w:hAnsi="Arial"/>
           <w:sz w:val="19"/>
         </w:rPr>
-        <w:t xml:space="preserve">   Fonte: </w:t>
-      </w:r>
-      <w:r>
-        <w:rPr>
-          <w:i/>
-          <w:color w:val="57606A"/>
-          <w:sz w:val="19"/>
-        </w:rPr>
-        <w:t>SALES, André Barros de. Plano de ensino FIHC 022026 – Turma 01. Brasília: FCTE/UnB, 2026.</w:t>
+        <w:t>Fonte: SALES, André Barros de. Plano de ensino FIHC 022026 – Turma 01. Brasília: FCTE/UnB, 2026.</w:t>
       </w:r>
     </w:p>
     <w:p>
       <w:pPr>
         <w:keepNext/>
-        <w:spacing w:before="160" w:after="40"/>
+        <w:spacing w:before="80" w:after="80"/>
+        <w:jc w:val="left"/>
       </w:pPr>
       <w:r>
         <w:rPr>
+          <w:rFonts w:ascii="Arial" w:hAnsi="Arial"/>
           <w:b/>
           <w:sz w:val="21"/>
         </w:rPr>
-        <w:t xml:space="preserve">12) </w:t>
-      </w:r>
-      <w:r>
-        <w:rPr>
-          <w:sz w:val="21"/>
-        </w:rPr>
-        <w:t>O planejamento da avaliação segue o Framework DECIDE?</w:t>
+        <w:t>12) O planejamento da avaliação segue o Framework DECIDE?</w:t>
       </w:r>
     </w:p>
     <w:p>
       <w:pPr>
         <w:keepNext/>
-        <w:spacing w:before="40" w:after="40"/>
+        <w:spacing w:before="0" w:after="80"/>
+        <w:jc w:val="center"/>
       </w:pPr>
       <w:r>
         <w:rPr>
-          <w:b/>
-          <w:color w:val="333333"/>
+          <w:rFonts w:ascii="Arial" w:hAnsi="Arial"/>
           <w:sz w:val="20"/>
         </w:rPr>
-        <w:t xml:space="preserve">   (   ) Sim          (   ) Não          (   ) Incompleto</w:t>
+        <w:t>(  ) Conforme          (  ) Não conforme          (  ) Não se aplica</w:t>
       </w:r>
     </w:p>
     <w:p>
       <w:pPr>
-        <w:spacing w:before="20" w:after="120"/>
+        <w:spacing w:before="0" w:after="280"/>
+        <w:jc w:val="left"/>
       </w:pPr>
       <w:r>
         <w:rPr>
-          <w:b/>
-          <w:color w:val="57606A"/>
+          <w:rFonts w:ascii="Arial" w:hAnsi="Arial"/>
           <w:sz w:val="19"/>
         </w:rPr>
-        <w:t xml:space="preserve">   Fonte: </w:t>
-      </w:r>
-      <w:r>
-        <w:rPr>
-          <w:i/>
-          <w:color w:val="57606A"/>
-          <w:sz w:val="19"/>
-        </w:rPr>
-        <w:t>BARBOSA et al. (2021), Cap. 11, Seção 11.8 (O Framework DECIDE), p. 303–304; PREECE et al. (2002).</w:t>
+        <w:t>Fonte: BARBOSA et al. (2021), Cap. 11, Seção 11.8 (O Framework DECIDE), p. 303-304; PREECE et al. (2002).</w:t>
       </w:r>
     </w:p>
     <w:p>
       <w:pPr>
         <w:keepNext/>
-        <w:spacing w:before="160" w:after="40"/>
+        <w:spacing w:before="80" w:after="80"/>
+        <w:jc w:val="left"/>
       </w:pPr>
       <w:r>
         <w:rPr>
+          <w:rFonts w:ascii="Arial" w:hAnsi="Arial"/>
           <w:b/>
           <w:sz w:val="21"/>
         </w:rPr>
-        <w:t xml:space="preserve">13) </w:t>
-      </w:r>
-      <w:r>
-        <w:rPr>
-          <w:sz w:val="21"/>
-        </w:rPr>
-        <w:t>Descreve o(s) objetivo(s) da avaliação? (apropriação de tecnologia pelos usuários; ideias e alternativas de design; conformidade com um padrão; e/ou problemas na interação e na interface na fase do modelo conceitual)</w:t>
+        <w:t>13) Descreve o(s) objetivo(s) da avaliação? (apropriação de tecnologia pelos usuários; ideias e alternativas de design; conformidade com um padrão; e/ou problemas na interação e na interface na fase do modelo conceitual)</w:t>
       </w:r>
     </w:p>
     <w:p>
       <w:pPr>
         <w:keepNext/>
-        <w:spacing w:before="40" w:after="40"/>
+        <w:spacing w:before="0" w:after="80"/>
+        <w:jc w:val="center"/>
       </w:pPr>
       <w:r>
         <w:rPr>
-          <w:b/>
-          <w:color w:val="333333"/>
+          <w:rFonts w:ascii="Arial" w:hAnsi="Arial"/>
           <w:sz w:val="20"/>
         </w:rPr>
-        <w:t xml:space="preserve">   (   ) Sim          (   ) Não          (   ) Incompleto</w:t>
+        <w:t>(  ) Conforme          (  ) Não conforme          (  ) Não se aplica</w:t>
       </w:r>
     </w:p>
     <w:p>
       <w:pPr>
-        <w:spacing w:before="20" w:after="120"/>
+        <w:spacing w:before="0" w:after="280"/>
+        <w:jc w:val="left"/>
       </w:pPr>
       <w:r>
         <w:rPr>
-          <w:b/>
-          <w:color w:val="57606A"/>
+          <w:rFonts w:ascii="Arial" w:hAnsi="Arial"/>
           <w:sz w:val="19"/>
         </w:rPr>
-        <w:t xml:space="preserve">   Fonte: </w:t>
-      </w:r>
-      <w:r>
-        <w:rPr>
-          <w:i/>
-          <w:color w:val="57606A"/>
-          <w:sz w:val="19"/>
-        </w:rPr>
-        <w:t>BARBOSA et al. (2021), Cap. 11, Seção 11.2 e 11.8 (Determinar os Objetivos), p. 297 e 303.</w:t>
+        <w:t>Fonte: BARBOSA et al. (2021), Cap. 11, Seção 11.2 e 11.8 (Determinar os Objetivos), p. 297 e 303.</w:t>
       </w:r>
     </w:p>
     <w:p>
       <w:pPr>
         <w:keepNext/>
-        <w:spacing w:before="160" w:after="40"/>
+        <w:spacing w:before="80" w:after="80"/>
+        <w:jc w:val="left"/>
       </w:pPr>
       <w:r>
         <w:rPr>
+          <w:rFonts w:ascii="Arial" w:hAnsi="Arial"/>
           <w:b/>
           <w:sz w:val="21"/>
         </w:rPr>
-        <w:t xml:space="preserve">14) </w:t>
-      </w:r>
-      <w:r>
-        <w:rPr>
-          <w:sz w:val="21"/>
-        </w:rPr>
-        <w:t>Os métodos de avaliação a serem utilizados? Adicionar referência bibliográfica da fonte e foto do texto da referência explicando os métodos de avaliação.</w:t>
+        <w:t>14) Os métodos de avaliação a serem utilizados? Adicionar referência bibliográfica da fonte e foto do texto da referência explicando os métodos de avaliação.</w:t>
       </w:r>
     </w:p>
     <w:p>
       <w:pPr>
         <w:keepNext/>
-        <w:spacing w:before="40" w:after="40"/>
+        <w:spacing w:before="0" w:after="80"/>
+        <w:jc w:val="center"/>
       </w:pPr>
       <w:r>
         <w:rPr>
-          <w:b/>
-          <w:color w:val="333333"/>
+          <w:rFonts w:ascii="Arial" w:hAnsi="Arial"/>
           <w:sz w:val="20"/>
         </w:rPr>
-        <w:t xml:space="preserve">   (   ) Sim          (   ) Não          (   ) Incompleto</w:t>
+        <w:t>(  ) Conforme          (  ) Não conforme          (  ) Não se aplica</w:t>
+      </w:r>
+    </w:p>
+    <w:p>
+      <w:pPr>
+        <w:spacing w:before="0" w:after="280"/>
+        <w:jc w:val="left"/>
+      </w:pPr>
+      <w:r>
+        <w:rPr>
+          <w:rFonts w:ascii="Arial" w:hAnsi="Arial"/>
+          <w:sz w:val="19"/>
+        </w:rPr>
+        <w:t>Fonte: BARBOSA et al. (2021), Cap. 11, Seção 11.7.3 e 11.8 (Escolher os Métodos de Avaliação), p. 300-304.</w:t>
       </w:r>
     </w:p>
     <w:p>
       <w:pPr>
         <w:keepNext/>
-        <w:spacing w:before="20" w:after="40"/>
+        <w:spacing w:before="80" w:after="80"/>
+        <w:jc w:val="left"/>
       </w:pPr>
       <w:r>
         <w:rPr>
-          <w:i/>
-          <w:sz w:val="19"/>
+          <w:rFonts w:ascii="Arial" w:hAnsi="Arial"/>
+          <w:b/>
+          <w:sz w:val="21"/>
         </w:rPr>
-        <w:t xml:space="preserve">   Autor: Prof. Dr. André Barros de Sales / Equipe</w:t>
-      </w:r>
-    </w:p>
-    <w:p>
-      <w:pPr>
-        <w:spacing w:before="20" w:after="120"/>
-      </w:pPr>
-      <w:r>
-        <w:rPr>
-          <w:b/>
-          <w:color w:val="57606A"/>
-          <w:sz w:val="19"/>
-        </w:rPr>
-        <w:t xml:space="preserve">   Fonte: </w:t>
-      </w:r>
-      <w:r>
-        <w:rPr>
-          <w:i/>
-          <w:color w:val="57606A"/>
-          <w:sz w:val="19"/>
-        </w:rPr>
-        <w:t>BARBOSA et al. (2021), Cap. 11, Seção 11.7.3 e 11.8 (Escolher os Métodos de Avaliação), p. 300–304.</w:t>
+        <w:t>15) As questões práticas da avaliação (sobre o recrutamento dos usuários que participarão da avaliação (onde e o perfil), quantos usuários participarão da avaliação e a razão dessa quantidade, presencial real ou remota; a preparação e o uso dos equipamentos necessários, os prazos; o orçamento; recursos de mão-de-obra necessária para conduzir a avaliação)?</w:t>
       </w:r>
     </w:p>
     <w:p>
       <w:pPr>
         <w:keepNext/>
-        <w:spacing w:before="160" w:after="40"/>
+        <w:spacing w:before="0" w:after="80"/>
+        <w:jc w:val="center"/>
       </w:pPr>
       <w:r>
         <w:rPr>
-          <w:b/>
-          <w:sz w:val="21"/>
+          <w:rFonts w:ascii="Arial" w:hAnsi="Arial"/>
+          <w:sz w:val="20"/>
         </w:rPr>
-        <w:t xml:space="preserve">15) </w:t>
+        <w:t>(  ) Conforme          (  ) Não conforme          (  ) Não se aplica</w:t>
       </w:r>
+    </w:p>
+    <w:p>
+      <w:pPr>
+        <w:spacing w:before="0" w:after="280"/>
+        <w:jc w:val="left"/>
+      </w:pPr>
       <w:r>
         <w:rPr>
-          <w:sz w:val="21"/>
+          <w:rFonts w:ascii="Arial" w:hAnsi="Arial"/>
+          <w:sz w:val="19"/>
         </w:rPr>
-        <w:t>As questões práticas da avaliação (sobre o recrutamento dos usuários que participarão da avaliação (onde e o perfil), quantos usuários participarão da avaliação e a razão dessa quantidade, presencial real ou remota; a preparação e o uso dos equipamentos necessários, os prazos; o orçamento; recursos de mão-de-obra necessária para conduzir a avaliação)?</w:t>
+        <w:t>Fonte: BARBOSA et al. (2021), Cap. 11, Seção 11.7.2 e 11.8 (Identificar e Administrar as Questões Práticas), p. 298 e 304.</w:t>
       </w:r>
     </w:p>
     <w:p>
       <w:pPr>
         <w:keepNext/>
-        <w:spacing w:before="40" w:after="40"/>
+        <w:spacing w:before="80" w:after="80"/>
+        <w:jc w:val="left"/>
       </w:pPr>
       <w:r>
         <w:rPr>
+          <w:rFonts w:ascii="Arial" w:hAnsi="Arial"/>
           <w:b/>
-          <w:color w:val="333333"/>
-          <w:sz w:val="20"/>
+          <w:sz w:val="21"/>
         </w:rPr>
-        <w:t xml:space="preserve">   (   ) Sim          (   ) Não          (   ) Incompleto</w:t>
-      </w:r>
-    </w:p>
-    <w:p>
-      <w:pPr>
-        <w:spacing w:before="20" w:after="120"/>
-      </w:pPr>
-      <w:r>
-        <w:rPr>
-          <w:b/>
-          <w:color w:val="57606A"/>
-          <w:sz w:val="19"/>
-        </w:rPr>
-        <w:t xml:space="preserve">   Fonte: </w:t>
-      </w:r>
-      <w:r>
-        <w:rPr>
-          <w:i/>
-          <w:color w:val="57606A"/>
-          <w:sz w:val="19"/>
-        </w:rPr>
-        <w:t>BARBOSA et al. (2021), Cap. 11, Seção 11.7.2 e 11.8 (Identificar e Administrar as Questões Práticas), p. 298 e 304.</w:t>
+        <w:t>16) As questões éticas (se os participantes da avaliação devem ser respeitados e não podem ser prejudicados direta ou indiretamente, nem durante os experimentos, nem após a divulgação dos resultados da avaliação)?</w:t>
       </w:r>
     </w:p>
     <w:p>
       <w:pPr>
         <w:keepNext/>
-        <w:spacing w:before="160" w:after="40"/>
+        <w:spacing w:before="0" w:after="80"/>
+        <w:jc w:val="center"/>
       </w:pPr>
       <w:r>
         <w:rPr>
-          <w:b/>
-          <w:sz w:val="21"/>
+          <w:rFonts w:ascii="Arial" w:hAnsi="Arial"/>
+          <w:sz w:val="20"/>
         </w:rPr>
-        <w:t xml:space="preserve">16) </w:t>
+        <w:t>(  ) Conforme          (  ) Não conforme          (  ) Não se aplica</w:t>
       </w:r>
+    </w:p>
+    <w:p>
+      <w:pPr>
+        <w:spacing w:before="0" w:after="280"/>
+        <w:jc w:val="left"/>
+      </w:pPr>
       <w:r>
         <w:rPr>
-          <w:sz w:val="21"/>
+          <w:rFonts w:ascii="Arial" w:hAnsi="Arial"/>
+          <w:sz w:val="19"/>
         </w:rPr>
-        <w:t>As questões éticas (se os participantes da avaliação devem ser respeitados e não podem ser prejudicados direta ou indiretamente, nem durante os experimentos, nem após a divulgação dos resultados da avaliação)?</w:t>
+        <w:t>Fonte: BARBOSA et al. (2021), Cap. 11, Seção 11.8 (Decidir como Lidar com Questões Éticas), p. 304; Resolução CNS nº 466/2012.</w:t>
       </w:r>
     </w:p>
     <w:p>
       <w:pPr>
         <w:keepNext/>
-        <w:spacing w:before="40" w:after="40"/>
+        <w:spacing w:before="80" w:after="80"/>
+        <w:jc w:val="left"/>
       </w:pPr>
       <w:r>
         <w:rPr>
+          <w:rFonts w:ascii="Arial" w:hAnsi="Arial"/>
           <w:b/>
-          <w:color w:val="333333"/>
-          <w:sz w:val="20"/>
+          <w:sz w:val="21"/>
         </w:rPr>
-        <w:t xml:space="preserve">   (   ) Sim          (   ) Não          (   ) Incompleto</w:t>
-      </w:r>
-    </w:p>
-    <w:p>
-      <w:pPr>
-        <w:spacing w:before="20" w:after="120"/>
-      </w:pPr>
-      <w:r>
-        <w:rPr>
-          <w:b/>
-          <w:color w:val="57606A"/>
-          <w:sz w:val="19"/>
-        </w:rPr>
-        <w:t xml:space="preserve">   Fonte: </w:t>
-      </w:r>
-      <w:r>
-        <w:rPr>
-          <w:i/>
-          <w:color w:val="57606A"/>
-          <w:sz w:val="19"/>
-        </w:rPr>
-        <w:t>BARBOSA et al. (2021), Cap. 11, Seção 11.8 (Decidir como Lidar com Questões Éticas), p. 304; Resolução CNS nº 466/2012.</w:t>
+        <w:t>17) A estrutura do relatório do resultado da avaliação (os objetivos da avaliação; uma breve descrição do método de prototipação em papel; o número e o perfil de avaliadores e dos participantes; as tarefas executadas pelos participantes; lista de problemas encontrados etc)?</w:t>
       </w:r>
     </w:p>
     <w:p>
       <w:pPr>
         <w:keepNext/>
-        <w:spacing w:before="160" w:after="40"/>
+        <w:spacing w:before="0" w:after="80"/>
+        <w:jc w:val="center"/>
       </w:pPr>
       <w:r>
         <w:rPr>
-          <w:b/>
-          <w:sz w:val="21"/>
+          <w:rFonts w:ascii="Arial" w:hAnsi="Arial"/>
+          <w:sz w:val="20"/>
         </w:rPr>
-        <w:t xml:space="preserve">17) </w:t>
+        <w:t>(  ) Conforme          (  ) Não conforme          (  ) Não se aplica</w:t>
       </w:r>
+    </w:p>
+    <w:p>
+      <w:pPr>
+        <w:spacing w:before="0" w:after="280"/>
+        <w:jc w:val="left"/>
+      </w:pPr>
       <w:r>
         <w:rPr>
-          <w:sz w:val="21"/>
+          <w:rFonts w:ascii="Arial" w:hAnsi="Arial"/>
+          <w:sz w:val="19"/>
         </w:rPr>
-        <w:t>A estrutura do relatório do resultado da avaliação (os objetivos da avaliação; uma breve descrição do método de prototipação em papel; o número e o perfil de avaliadores e dos participantes; as tarefas executadas pelos participantes; lista de problemas encontrados etc)?</w:t>
+        <w:t>Fonte: BARBOSA et al. (2021), Cap. 11, Seção 11.7.5 (Consolidação e Relato dos Resultados), p. 303.</w:t>
       </w:r>
     </w:p>
     <w:p>
       <w:pPr>
         <w:keepNext/>
-        <w:spacing w:before="40" w:after="40"/>
+        <w:spacing w:before="80" w:after="80"/>
+        <w:jc w:val="left"/>
       </w:pPr>
       <w:r>
         <w:rPr>
+          <w:rFonts w:ascii="Arial" w:hAnsi="Arial"/>
           <w:b/>
-          <w:color w:val="333333"/>
-          <w:sz w:val="20"/>
+          <w:sz w:val="21"/>
         </w:rPr>
-        <w:t xml:space="preserve">   (   ) Sim          (   ) Não          (   ) Incompleto</w:t>
-      </w:r>
-    </w:p>
-    <w:p>
-      <w:pPr>
-        <w:spacing w:before="20" w:after="120"/>
-      </w:pPr>
-      <w:r>
-        <w:rPr>
-          <w:b/>
-          <w:color w:val="57606A"/>
-          <w:sz w:val="19"/>
-        </w:rPr>
-        <w:t xml:space="preserve">   Fonte: </w:t>
-      </w:r>
-      <w:r>
-        <w:rPr>
-          <w:i/>
-          <w:color w:val="57606A"/>
-          <w:sz w:val="19"/>
-        </w:rPr>
-        <w:t>BARBOSA et al. (2021), Cap. 11, Seção 11.7.5 (Consolidação e Relato dos Resultados), p. 303.</w:t>
+        <w:t>18) Um cronograma (data e horário) e local para realização da avaliação do StoryBoard e da Análise das Tarefas?</w:t>
       </w:r>
     </w:p>
     <w:p>
       <w:pPr>
         <w:keepNext/>
-        <w:spacing w:before="160" w:after="40"/>
+        <w:spacing w:before="0" w:after="80"/>
+        <w:jc w:val="center"/>
       </w:pPr>
       <w:r>
         <w:rPr>
-          <w:b/>
-          <w:sz w:val="21"/>
+          <w:rFonts w:ascii="Arial" w:hAnsi="Arial"/>
+          <w:sz w:val="20"/>
         </w:rPr>
-        <w:t xml:space="preserve">18) </w:t>
+        <w:t>(  ) Conforme          (  ) Não conforme          (  ) Não se aplica</w:t>
       </w:r>
+    </w:p>
+    <w:p>
+      <w:pPr>
+        <w:spacing w:before="0" w:after="280"/>
+        <w:jc w:val="left"/>
+      </w:pPr>
       <w:r>
         <w:rPr>
-          <w:sz w:val="21"/>
+          <w:rFonts w:ascii="Arial" w:hAnsi="Arial"/>
+          <w:sz w:val="19"/>
         </w:rPr>
-        <w:t>Um cronograma (data e horário) e local para realização da avaliação do StoryBoard e da Análise das Tarefas?</w:t>
+        <w:t>Fonte: BARBOSA et al. (2021), Cap. 11, Seção 11.7.2 (Prazos e Cronograma Prático), p. 298.</w:t>
       </w:r>
     </w:p>
     <w:p>
       <w:pPr>
         <w:keepNext/>
-        <w:spacing w:before="40" w:after="40"/>
+        <w:spacing w:before="80" w:after="80"/>
+        <w:jc w:val="left"/>
       </w:pPr>
       <w:r>
         <w:rPr>
+          <w:rFonts w:ascii="Arial" w:hAnsi="Arial"/>
           <w:b/>
-          <w:color w:val="333333"/>
-          <w:sz w:val="20"/>
+          <w:sz w:val="21"/>
         </w:rPr>
-        <w:t xml:space="preserve">   (   ) Sim          (   ) Não          (   ) Incompleto</w:t>
-      </w:r>
-    </w:p>
-    <w:p>
-      <w:pPr>
-        <w:spacing w:before="20" w:after="120"/>
-      </w:pPr>
-      <w:r>
-        <w:rPr>
-          <w:b/>
-          <w:color w:val="57606A"/>
-          <w:sz w:val="19"/>
-        </w:rPr>
-        <w:t xml:space="preserve">   Fonte: </w:t>
-      </w:r>
-      <w:r>
-        <w:rPr>
-          <w:i/>
-          <w:color w:val="57606A"/>
-          <w:sz w:val="19"/>
-        </w:rPr>
-        <w:t>BARBOSA et al. (2021), Cap. 11, Seção 11.7.2 (Prazos e Cronograma Prático), p. 298.</w:t>
+        <w:t>19) Cada desenho do StoryBoard está relacionado a uma especificação do artefato da Análise de Tarefas?</w:t>
       </w:r>
     </w:p>
     <w:p>
       <w:pPr>
         <w:keepNext/>
-        <w:spacing w:before="160" w:after="40"/>
+        <w:spacing w:before="0" w:after="80"/>
+        <w:jc w:val="center"/>
       </w:pPr>
       <w:r>
         <w:rPr>
-          <w:b/>
-          <w:sz w:val="21"/>
+          <w:rFonts w:ascii="Arial" w:hAnsi="Arial"/>
+          <w:sz w:val="20"/>
         </w:rPr>
-        <w:t xml:space="preserve">19) </w:t>
+        <w:t>(  ) Conforme          (  ) Não conforme          (  ) Não se aplica</w:t>
       </w:r>
+    </w:p>
+    <w:p>
+      <w:pPr>
+        <w:spacing w:before="0" w:after="280"/>
+        <w:jc w:val="left"/>
+      </w:pPr>
       <w:r>
         <w:rPr>
-          <w:sz w:val="21"/>
+          <w:rFonts w:ascii="Arial" w:hAnsi="Arial"/>
+          <w:sz w:val="19"/>
         </w:rPr>
-        <w:t>Cada desenho do StoryBoard está relacionado a uma especificação do artefato da Análise de Tarefas?</w:t>
+        <w:t>Fonte: BARBOSA et al. (2021), Cap. 10 (Design e Storyboarding) e Cap. 7 (Análise de Tarefas), p. 268-275.</w:t>
       </w:r>
     </w:p>
     <w:p>
       <w:pPr>
         <w:keepNext/>
-        <w:spacing w:before="40" w:after="40"/>
+        <w:spacing w:before="80" w:after="80"/>
+        <w:jc w:val="left"/>
       </w:pPr>
       <w:r>
         <w:rPr>
+          <w:rFonts w:ascii="Arial" w:hAnsi="Arial"/>
           <w:b/>
-          <w:color w:val="333333"/>
-          <w:sz w:val="20"/>
+          <w:sz w:val="21"/>
         </w:rPr>
-        <w:t xml:space="preserve">   (   ) Sim          (   ) Não          (   ) Incompleto</w:t>
-      </w:r>
-    </w:p>
-    <w:p>
-      <w:pPr>
-        <w:spacing w:before="20" w:after="120"/>
-      </w:pPr>
-      <w:r>
-        <w:rPr>
-          <w:b/>
-          <w:color w:val="57606A"/>
-          <w:sz w:val="19"/>
-        </w:rPr>
-        <w:t xml:space="preserve">   Fonte: </w:t>
-      </w:r>
-      <w:r>
-        <w:rPr>
-          <w:i/>
-          <w:color w:val="57606A"/>
-          <w:sz w:val="19"/>
-        </w:rPr>
-        <w:t>BARBOSA et al. (2021), Cap. 10 (Design e Storyboarding) e Cap. 7 (Análise de Tarefas), p. 268–275.</w:t>
+        <w:t>20) A quantidade de storyboards é igual à quantidade de integrantes do grupo?</w:t>
       </w:r>
     </w:p>
     <w:p>
       <w:pPr>
         <w:keepNext/>
-        <w:spacing w:before="160" w:after="40"/>
+        <w:spacing w:before="0" w:after="80"/>
+        <w:jc w:val="center"/>
       </w:pPr>
       <w:r>
         <w:rPr>
-          <w:b/>
-          <w:sz w:val="21"/>
+          <w:rFonts w:ascii="Arial" w:hAnsi="Arial"/>
+          <w:sz w:val="20"/>
         </w:rPr>
-        <w:t xml:space="preserve">20) </w:t>
+        <w:t>(  ) Conforme          (  ) Não conforme          (  ) Não se aplica</w:t>
       </w:r>
+    </w:p>
+    <w:p>
+      <w:pPr>
+        <w:spacing w:before="0" w:after="280"/>
+        <w:jc w:val="left"/>
+      </w:pPr>
       <w:r>
         <w:rPr>
-          <w:sz w:val="21"/>
+          <w:rFonts w:ascii="Arial" w:hAnsi="Arial"/>
+          <w:sz w:val="19"/>
         </w:rPr>
-        <w:t>A quantidade de storyboards é igual à quantidade de integrantes do grupo?</w:t>
+        <w:t>Fonte: SALES, André Barros de. Diretrizes para Elaboração dos Storyboards (Etapa 4). Brasília: FCTE/UnB, 2026.</w:t>
       </w:r>
     </w:p>
     <w:p>
       <w:pPr>
         <w:keepNext/>
-        <w:spacing w:before="40" w:after="40"/>
+        <w:spacing w:before="80" w:after="80"/>
+        <w:jc w:val="left"/>
       </w:pPr>
       <w:r>
         <w:rPr>
+          <w:rFonts w:ascii="Arial" w:hAnsi="Arial"/>
           <w:b/>
-          <w:color w:val="333333"/>
-          <w:sz w:val="20"/>
+          <w:sz w:val="21"/>
         </w:rPr>
-        <w:t xml:space="preserve">   (   ) Sim          (   ) Não          (   ) Incompleto</w:t>
-      </w:r>
-    </w:p>
-    <w:p>
-      <w:pPr>
-        <w:spacing w:before="20" w:after="120"/>
-      </w:pPr>
-      <w:r>
-        <w:rPr>
-          <w:b/>
-          <w:color w:val="57606A"/>
-          <w:sz w:val="19"/>
-        </w:rPr>
-        <w:t xml:space="preserve">   Fonte: </w:t>
-      </w:r>
-      <w:r>
-        <w:rPr>
-          <w:i/>
-          <w:color w:val="57606A"/>
-          <w:sz w:val="19"/>
-        </w:rPr>
-        <w:t>SALES, André Barros de. Diretrizes para Elaboração dos Storyboards (Etapa 4). Brasília: FCTE/UnB, 2026.</w:t>
+        <w:t>21) A definição do teste piloto e data para realização do teste piloto antes da avaliação? Adicionar referência bibliográfica da fonte e foto do texto da referência explicando o teste piloto.</w:t>
       </w:r>
     </w:p>
     <w:p>
       <w:pPr>
         <w:keepNext/>
-        <w:spacing w:before="160" w:after="40"/>
+        <w:spacing w:before="0" w:after="80"/>
+        <w:jc w:val="center"/>
       </w:pPr>
       <w:r>
         <w:rPr>
-          <w:b/>
-          <w:sz w:val="21"/>
+          <w:rFonts w:ascii="Arial" w:hAnsi="Arial"/>
+          <w:sz w:val="20"/>
         </w:rPr>
-        <w:t xml:space="preserve">21) </w:t>
+        <w:t>(  ) Conforme          (  ) Não conforme          (  ) Não se aplica</w:t>
       </w:r>
+    </w:p>
+    <w:p>
+      <w:pPr>
+        <w:spacing w:before="0" w:after="280"/>
+        <w:jc w:val="left"/>
+      </w:pPr>
       <w:r>
         <w:rPr>
-          <w:sz w:val="21"/>
+          <w:rFonts w:ascii="Arial" w:hAnsi="Arial"/>
+          <w:sz w:val="19"/>
         </w:rPr>
-        <w:t>A definição do teste piloto e data para realização do teste piloto antes da avaliação? Adicionar referência bibliográfica da fonte e foto do texto da referência explicando o teste piloto.</w:t>
+        <w:t>Fonte: BARBOSA et al. (2021), Cap. 11, Seção 11.7.4 (Teste-Piloto), p. 302.</w:t>
       </w:r>
     </w:p>
     <w:p>
       <w:pPr>
         <w:keepNext/>
-        <w:spacing w:before="40" w:after="40"/>
+        <w:spacing w:before="80" w:after="80"/>
+        <w:jc w:val="left"/>
       </w:pPr>
       <w:r>
         <w:rPr>
+          <w:rFonts w:ascii="Arial" w:hAnsi="Arial"/>
           <w:b/>
-          <w:color w:val="333333"/>
-          <w:sz w:val="20"/>
+          <w:sz w:val="21"/>
         </w:rPr>
-        <w:t xml:space="preserve">   (   ) Sim          (   ) Não          (   ) Incompleto</w:t>
+        <w:t>22) O resultado do teste piloto não será apresentado no resultado da avaliação?</w:t>
       </w:r>
     </w:p>
     <w:p>
       <w:pPr>
         <w:keepNext/>
-        <w:spacing w:before="20" w:after="40"/>
+        <w:spacing w:before="0" w:after="80"/>
+        <w:jc w:val="center"/>
       </w:pPr>
       <w:r>
         <w:rPr>
-          <w:i/>
-          <w:sz w:val="19"/>
+          <w:rFonts w:ascii="Arial" w:hAnsi="Arial"/>
+          <w:sz w:val="20"/>
         </w:rPr>
-        <w:t xml:space="preserve">   Autor: Prof. Dr. André Barros de Sales / Equipe</w:t>
+        <w:t>(  ) Conforme          (  ) Não conforme          (  ) Não se aplica</w:t>
       </w:r>
     </w:p>
     <w:p>
       <w:pPr>
-        <w:spacing w:before="20" w:after="120"/>
+        <w:spacing w:before="0" w:after="280"/>
+        <w:jc w:val="left"/>
       </w:pPr>
       <w:r>
         <w:rPr>
-          <w:b/>
-          <w:color w:val="57606A"/>
+          <w:rFonts w:ascii="Arial" w:hAnsi="Arial"/>
           <w:sz w:val="19"/>
         </w:rPr>
-        <w:t xml:space="preserve">   Fonte: </w:t>
-      </w:r>
-      <w:r>
-        <w:rPr>
-          <w:i/>
-          <w:color w:val="57606A"/>
-          <w:sz w:val="19"/>
-        </w:rPr>
-        <w:t>BARBOSA et al. (2021), Cap. 11, Seção 11.7.4 (Teste-Piloto), p. 302.</w:t>
+        <w:t>Fonte: BARBOSA et al. (2021), Cap. 11, Seção 11.7.4 (Descarte dos Dados Preliminares do Teste-Piloto), p. 302.</w:t>
       </w:r>
     </w:p>
     <w:p>
       <w:pPr>
         <w:keepNext/>
-        <w:spacing w:before="160" w:after="40"/>
+        <w:spacing w:before="80" w:after="80"/>
+        <w:jc w:val="left"/>
       </w:pPr>
       <w:r>
         <w:rPr>
+          <w:rFonts w:ascii="Arial" w:hAnsi="Arial"/>
           <w:b/>
           <w:sz w:val="21"/>
         </w:rPr>
-        <w:t xml:space="preserve">22) </w:t>
-      </w:r>
-      <w:r>
-        <w:rPr>
-          <w:sz w:val="21"/>
-        </w:rPr>
-        <w:t>O resultado do teste piloto não será apresentado no resultado da avaliação?</w:t>
+        <w:t>23) Os itens que o avaliador deve realizar/anotar durante a avaliação (listar os problemas encontrados, priorizar a correção dos problemas não resolvidos)?</w:t>
       </w:r>
     </w:p>
     <w:p>
       <w:pPr>
         <w:keepNext/>
-        <w:spacing w:before="40" w:after="40"/>
+        <w:spacing w:before="0" w:after="80"/>
+        <w:jc w:val="center"/>
       </w:pPr>
       <w:r>
         <w:rPr>
-          <w:b/>
-          <w:color w:val="333333"/>
+          <w:rFonts w:ascii="Arial" w:hAnsi="Arial"/>
           <w:sz w:val="20"/>
         </w:rPr>
-        <w:t xml:space="preserve">   (   ) Sim          (   ) Não          (   ) Incompleto</w:t>
+        <w:t>(  ) Conforme          (  ) Não conforme          (  ) Não se aplica</w:t>
       </w:r>
     </w:p>
     <w:p>
       <w:pPr>
-        <w:spacing w:before="20" w:after="120"/>
+        <w:spacing w:before="0" w:after="280"/>
+        <w:jc w:val="left"/>
       </w:pPr>
       <w:r>
         <w:rPr>
-          <w:b/>
-          <w:color w:val="57606A"/>
+          <w:rFonts w:ascii="Arial" w:hAnsi="Arial"/>
           <w:sz w:val="19"/>
         </w:rPr>
-        <w:t xml:space="preserve">   Fonte: </w:t>
-      </w:r>
-      <w:r>
-        <w:rPr>
-          <w:i/>
-          <w:color w:val="57606A"/>
-          <w:sz w:val="19"/>
-        </w:rPr>
-        <w:t>BARBOSA et al. (2021), Cap. 11, Seção 11.7.4 (Descarte dos Dados Preliminares do Teste-Piloto), p. 302.</w:t>
+        <w:t>Fonte: BARBOSA et al. (2021), Cap. 11, Seção 11.7.3 e 11.7.5 (Anotação, Listagem e Priorização de Problemas), p. 302-303.</w:t>
       </w:r>
     </w:p>
     <w:p>
       <w:pPr>
         <w:keepNext/>
-        <w:spacing w:before="160" w:after="40"/>
+        <w:spacing w:before="240" w:after="120"/>
+        <w:jc w:val="left"/>
       </w:pPr>
       <w:r>
         <w:rPr>
+          <w:rFonts w:ascii="Arial" w:hAnsi="Arial"/>
           <w:b/>
-          <w:sz w:val="21"/>
+          <w:sz w:val="22"/>
         </w:rPr>
-        <w:t xml:space="preserve">23) </w:t>
-      </w:r>
-      <w:r>
-        <w:rPr>
-          <w:sz w:val="21"/>
-        </w:rPr>
-        <w:t>Os itens que o avaliador deve realizar/anotar durante a avaliação (listar os problemas encontrados, priorizar a correção dos problemas não resolvidos)?</w:t>
+        <w:t>ITENS ELABORADOS PELO GRUPO</w:t>
       </w:r>
     </w:p>
     <w:p>
       <w:pPr>
         <w:keepNext/>
-        <w:spacing w:before="40" w:after="40"/>
+        <w:spacing w:before="80" w:after="80"/>
+        <w:jc w:val="left"/>
       </w:pPr>
       <w:r>
         <w:rPr>
+          <w:rFonts w:ascii="Arial" w:hAnsi="Arial"/>
           <w:b/>
-          <w:color w:val="333333"/>
-          <w:sz w:val="20"/>
+          <w:sz w:val="21"/>
         </w:rPr>
-        <w:t xml:space="preserve">   (   ) Sim          (   ) Não          (   ) Incompleto</w:t>
-      </w:r>
-    </w:p>
-    <w:p>
-      <w:pPr>
-        <w:spacing w:before="20" w:after="120"/>
-      </w:pPr>
-      <w:r>
-        <w:rPr>
-          <w:b/>
-          <w:color w:val="57606A"/>
-          <w:sz w:val="19"/>
-        </w:rPr>
-        <w:t xml:space="preserve">   Fonte: </w:t>
-      </w:r>
-      <w:r>
-        <w:rPr>
-          <w:i/>
-          <w:color w:val="57606A"/>
-          <w:sz w:val="19"/>
-        </w:rPr>
-        <w:t>BARBOSA et al. (2021), Cap. 11, Seção 11.7.3 e 11.7.5 (Anotação, Listagem e Priorização de Problemas), p. 302–303.</w:t>
+        <w:t>24) Rigor e Execução do Teste-Piloto: Os planejamentos de avaliação (tanto de Análise de Tarefas quanto de Storyboard) preveem a execução obrigatória de um teste-piloto prévio com data, horário, papéis definidos (avaliador e usuário simulado), tarefas-teste e a diretriz explícita de descarte dos dados preliminares? (Autor: Arthur Sismene Carvalho)</w:t>
       </w:r>
     </w:p>
     <w:p>
       <w:pPr>
         <w:keepNext/>
-        <w:spacing w:before="280" w:after="120"/>
+        <w:spacing w:before="0" w:after="80"/>
+        <w:jc w:val="center"/>
       </w:pPr>
       <w:r>
         <w:rPr>
-          <w:b/>
-          <w:color w:val="0F2042"/>
-          <w:sz w:val="24"/>
+          <w:rFonts w:ascii="Arial" w:hAnsi="Arial"/>
+          <w:sz w:val="20"/>
         </w:rPr>
-        <w:t>BLOCO 3 — ITENS ELABORADOS PELO GRUPO (4 ITENS COM FOTOS E CITAÇÕES)</w:t>
+        <w:t>(  ) Conforme          (  ) Não conforme          (  ) Não se aplica</w:t>
       </w:r>
     </w:p>
     <w:p>
       <w:pPr>
         <w:keepNext/>
-        <w:spacing w:before="160" w:after="40"/>
+        <w:spacing w:before="0" w:after="40"/>
+        <w:jc w:val="left"/>
       </w:pPr>
       <w:r>
         <w:rPr>
+          <w:rFonts w:ascii="Arial" w:hAnsi="Arial"/>
           <w:b/>
-          <w:sz w:val="21"/>
+          <w:sz w:val="20"/>
         </w:rPr>
-        <w:t xml:space="preserve">24) </w:t>
-      </w:r>
-      <w:r>
-        <w:rPr>
-          <w:sz w:val="21"/>
-        </w:rPr>
-        <w:t>Rigor e Execução do Teste-Piloto: Os planejamentos de avaliação (tanto de Análise de Tarefas quanto de Storyboard) preveem a execução obrigatória de um teste-piloto prévio com data, horário, papéis definidos (avaliador e usuário simulado), tarefas-teste e a diretriz explícita de descarte dos dados preliminares?</w:t>
+        <w:t>Foto:</w:t>
       </w:r>
     </w:p>
     <w:p>
       <w:pPr>
         <w:keepNext/>
-        <w:spacing w:before="40" w:after="40"/>
-      </w:pPr>
-      <w:r>
-        <w:rPr>
-          <w:b/>
-          <w:color w:val="333333"/>
-          <w:sz w:val="20"/>
-        </w:rPr>
-        <w:t xml:space="preserve">   (   ) Sim          (   ) Não          (   ) Incompleto</w:t>
-      </w:r>
-    </w:p>
-    <w:p>
-      <w:pPr>
-        <w:keepNext/>
-        <w:spacing w:before="20" w:after="40"/>
-      </w:pPr>
-      <w:r>
-        <w:rPr>
-          <w:i/>
-          <w:sz w:val="19"/>
-        </w:rPr>
-        <w:t xml:space="preserve">   Autor do Item: Arthur Sismene Carvalho</w:t>
-      </w:r>
-    </w:p>
-    <w:p>
-      <w:pPr>
-        <w:keepNext/>
-        <w:spacing w:before="80" w:after="40"/>
-        <w:jc w:val="center"/>
-      </w:pPr>
-      <w:r>
-        <w:rPr>
-          <w:b/>
-          <w:sz w:val="19"/>
-        </w:rPr>
-        <w:t>Figura 1: Referência Bibliográfica — O Teste-Piloto em Avaliação de IHC (BARBOSA et al., 2021, p. 298)</w:t>
-      </w:r>
-    </w:p>
-    <w:p>
-      <w:pPr>
-        <w:keepNext/>
-        <w:spacing w:before="40" w:after="40"/>
+        <w:spacing w:before="0" w:after="40"/>
         <w:jc w:val="center"/>
       </w:pPr>
       <w:r>
         <w:drawing>
           <wp:inline xmlns:a="http://schemas.openxmlformats.org/drawingml/2006/main" xmlns:pic="http://schemas.openxmlformats.org/drawingml/2006/picture">
-            <wp:extent cx="5029200" cy="2261427"/>
+            <wp:extent cx="5039989" cy="2266278"/>
             <wp:docPr id="1" name="Picture 1"/>
             <wp:cNvGraphicFramePr>
               <a:graphicFrameLocks noChangeAspect="1"/>
@@ -1551,7 +1125,7 @@
                   <pic:spPr>
                     <a:xfrm>
                       <a:off x="0" y="0"/>
-                      <a:ext cx="5029200" cy="2261427"/>
+                      <a:ext cx="5039989" cy="2266278"/>
                     </a:xfrm>
                     <a:prstGeom prst="rect"/>
                   </pic:spPr>
@@ -1564,95 +1138,71 @@
     </w:p>
     <w:p>
       <w:pPr>
-        <w:spacing w:before="20" w:after="120"/>
+        <w:spacing w:before="0" w:after="280"/>
+        <w:jc w:val="left"/>
       </w:pPr>
       <w:r>
         <w:rPr>
-          <w:b/>
-          <w:color w:val="57606A"/>
+          <w:rFonts w:ascii="Arial" w:hAnsi="Arial"/>
           <w:sz w:val="19"/>
         </w:rPr>
-        <w:t xml:space="preserve">   Fonte: </w:t>
-      </w:r>
-      <w:r>
-        <w:rPr>
-          <w:i/>
-          <w:color w:val="57606A"/>
-          <w:sz w:val="19"/>
-        </w:rPr>
-        <w:t>BARBOSA et al. (2021), Cap. 11, Seção 11.7.4 (Teste-Piloto), p. 302.</w:t>
+        <w:t>Fonte: BARBOSA et al. (2021), Cap. 11, Seção 11.7.4 (Teste-Piloto), p. 302.</w:t>
       </w:r>
     </w:p>
     <w:p>
       <w:pPr>
         <w:keepNext/>
-        <w:spacing w:before="160" w:after="40"/>
+        <w:spacing w:before="80" w:after="80"/>
+        <w:jc w:val="left"/>
       </w:pPr>
       <w:r>
         <w:rPr>
+          <w:rFonts w:ascii="Arial" w:hAnsi="Arial"/>
           <w:b/>
           <w:sz w:val="21"/>
         </w:rPr>
-        <w:t xml:space="preserve">25) </w:t>
-      </w:r>
-      <w:r>
-        <w:rPr>
-          <w:sz w:val="21"/>
-        </w:rPr>
-        <w:t>Mitigação do Viés de Concordância (Acquiescence Bias) na Entrevista: O roteiro e o procedimento de execução das entrevistas com usuários estipulam que o participante descreva primeiro como realiza a tarefa na interface atual ou fora dela, para apenas depois ter contato com o modelo ou desenho de proposta, prevenindo que o usuário concorde passivamente com o artefato exibido?</w:t>
+        <w:t>25) Mitigação do Viés de Concordância (Acquiescence Bias) na Entrevista: O roteiro e o procedimento de execução das entrevistas com usuários estipulam que o participante descreva primeiro como realiza a tarefa na interface atual ou fora dela, para apenas depois ter contato com o modelo ou desenho de proposta, prevenindo que o usuário concorde passivamente com o artefato exibido? (Autor: Daniel da Silva Batista)</w:t>
       </w:r>
     </w:p>
     <w:p>
       <w:pPr>
         <w:keepNext/>
-        <w:spacing w:before="40" w:after="40"/>
+        <w:spacing w:before="0" w:after="80"/>
+        <w:jc w:val="center"/>
       </w:pPr>
       <w:r>
         <w:rPr>
-          <w:b/>
-          <w:color w:val="333333"/>
+          <w:rFonts w:ascii="Arial" w:hAnsi="Arial"/>
           <w:sz w:val="20"/>
         </w:rPr>
-        <w:t xml:space="preserve">   (   ) Sim          (   ) Não          (   ) Incompleto</w:t>
+        <w:t>(  ) Conforme          (  ) Não conforme          (  ) Não se aplica</w:t>
       </w:r>
     </w:p>
     <w:p>
       <w:pPr>
         <w:keepNext/>
-        <w:spacing w:before="20" w:after="40"/>
+        <w:spacing w:before="0" w:after="40"/>
+        <w:jc w:val="left"/>
       </w:pPr>
       <w:r>
         <w:rPr>
-          <w:i/>
-          <w:sz w:val="19"/>
+          <w:rFonts w:ascii="Arial" w:hAnsi="Arial"/>
+          <w:b/>
+          <w:sz w:val="20"/>
         </w:rPr>
-        <w:t xml:space="preserve">   Autor do Item: Daniel da Silva Batista</w:t>
+        <w:t>Foto:</w:t>
       </w:r>
     </w:p>
     <w:p>
       <w:pPr>
         <w:keepNext/>
-        <w:spacing w:before="80" w:after="40"/>
-        <w:jc w:val="center"/>
-      </w:pPr>
-      <w:r>
-        <w:rPr>
-          <w:b/>
-          <w:sz w:val="19"/>
-        </w:rPr>
-        <w:t>Figura 2: Referência Bibliográfica — O Framework DECIDE e Condução Metodológica (BARBOSA et al., 2021, p. 303–304)</w:t>
-      </w:r>
-    </w:p>
-    <w:p>
-      <w:pPr>
-        <w:keepNext/>
-        <w:spacing w:before="40" w:after="40"/>
+        <w:spacing w:before="0" w:after="40"/>
         <w:jc w:val="center"/>
       </w:pPr>
       <w:r>
         <w:drawing>
           <wp:inline xmlns:a="http://schemas.openxmlformats.org/drawingml/2006/main" xmlns:pic="http://schemas.openxmlformats.org/drawingml/2006/picture">
-            <wp:extent cx="5029200" cy="4971876"/>
+            <wp:extent cx="5039989" cy="4982542"/>
             <wp:docPr id="2" name="Picture 2"/>
             <wp:cNvGraphicFramePr>
               <a:graphicFrameLocks noChangeAspect="1"/>
@@ -1673,7 +1223,7 @@
                   <pic:spPr>
                     <a:xfrm>
                       <a:off x="0" y="0"/>
-                      <a:ext cx="5029200" cy="4971876"/>
+                      <a:ext cx="5039989" cy="4982542"/>
                     </a:xfrm>
                     <a:prstGeom prst="rect"/>
                   </pic:spPr>
@@ -1686,95 +1236,71 @@
     </w:p>
     <w:p>
       <w:pPr>
-        <w:spacing w:before="20" w:after="120"/>
+        <w:spacing w:before="0" w:after="280"/>
+        <w:jc w:val="left"/>
       </w:pPr>
       <w:r>
         <w:rPr>
-          <w:b/>
-          <w:color w:val="57606A"/>
+          <w:rFonts w:ascii="Arial" w:hAnsi="Arial"/>
           <w:sz w:val="19"/>
         </w:rPr>
-        <w:t xml:space="preserve">   Fonte: </w:t>
-      </w:r>
-      <w:r>
-        <w:rPr>
-          <w:i/>
-          <w:color w:val="57606A"/>
-          <w:sz w:val="19"/>
-        </w:rPr>
-        <w:t>BARBOSA et al. (2021), Cap. 11, Seção 11.7.3 (Entrevistas e Técnicas de Investigação), p. 300–301; PREECE et al. (2002).</w:t>
+        <w:t>Fonte: BARBOSA et al. (2021), Cap. 11, Seção 11.7.3 (Entrevistas e Técnicas de Investigação), p. 300-301; PREECE et al. (2002).</w:t>
       </w:r>
     </w:p>
     <w:p>
       <w:pPr>
         <w:keepNext/>
-        <w:spacing w:before="160" w:after="40"/>
+        <w:spacing w:before="80" w:after="80"/>
+        <w:jc w:val="left"/>
       </w:pPr>
       <w:r>
         <w:rPr>
+          <w:rFonts w:ascii="Arial" w:hAnsi="Arial"/>
           <w:b/>
           <w:sz w:val="21"/>
         </w:rPr>
-        <w:t xml:space="preserve">26) </w:t>
-      </w:r>
-      <w:r>
-        <w:rPr>
-          <w:sz w:val="21"/>
-        </w:rPr>
-        <w:t>Escala Padronizada de Gravidade e Priorização de Problemas: Os planejamentos de relato estabelecem critérios objetivos e escalas formais de severidade (ex.: classificação em problema cosmético, leve, moderado, grave ou catastrófico) para fundamentar a tomada de decisão no reprojeto dos modelos e telas?</w:t>
+        <w:t>26) Escala Padronizada de Gravidade e Priorização de Problemas: Os planejamentos de relato estabelecem critérios objetivos e escalas formais de severidade (ex.: classificação em problema cosmético, leve, moderado, grave ou catastrófico) para fundamentar a tomada de decisão no reprojeto dos modelos e telas? (Autor: Pedro Rocha Ferreira Lima)</w:t>
       </w:r>
     </w:p>
     <w:p>
       <w:pPr>
         <w:keepNext/>
-        <w:spacing w:before="40" w:after="40"/>
+        <w:spacing w:before="0" w:after="80"/>
+        <w:jc w:val="center"/>
       </w:pPr>
       <w:r>
         <w:rPr>
-          <w:b/>
-          <w:color w:val="333333"/>
+          <w:rFonts w:ascii="Arial" w:hAnsi="Arial"/>
           <w:sz w:val="20"/>
         </w:rPr>
-        <w:t xml:space="preserve">   (   ) Sim          (   ) Não          (   ) Incompleto</w:t>
+        <w:t>(  ) Conforme          (  ) Não conforme          (  ) Não se aplica</w:t>
       </w:r>
     </w:p>
     <w:p>
       <w:pPr>
         <w:keepNext/>
-        <w:spacing w:before="20" w:after="40"/>
+        <w:spacing w:before="0" w:after="40"/>
+        <w:jc w:val="left"/>
       </w:pPr>
       <w:r>
         <w:rPr>
-          <w:i/>
-          <w:sz w:val="19"/>
+          <w:rFonts w:ascii="Arial" w:hAnsi="Arial"/>
+          <w:b/>
+          <w:sz w:val="20"/>
         </w:rPr>
-        <w:t xml:space="preserve">   Autor do Item: Pedro Rocha Ferreira Lima</w:t>
+        <w:t>Foto:</w:t>
       </w:r>
     </w:p>
     <w:p>
       <w:pPr>
         <w:keepNext/>
-        <w:spacing w:before="80" w:after="40"/>
-        <w:jc w:val="center"/>
-      </w:pPr>
-      <w:r>
-        <w:rPr>
-          <w:b/>
-          <w:sz w:val="19"/>
-        </w:rPr>
-        <w:t>Figura 3: Referência Bibliográfica — Consolidação e Relato dos Resultados (BARBOSA et al., 2021, p. 303)</w:t>
-      </w:r>
-    </w:p>
-    <w:p>
-      <w:pPr>
-        <w:keepNext/>
-        <w:spacing w:before="40" w:after="40"/>
+        <w:spacing w:before="0" w:after="40"/>
         <w:jc w:val="center"/>
       </w:pPr>
       <w:r>
         <w:drawing>
           <wp:inline xmlns:a="http://schemas.openxmlformats.org/drawingml/2006/main" xmlns:pic="http://schemas.openxmlformats.org/drawingml/2006/picture">
-            <wp:extent cx="5029200" cy="5398490"/>
+            <wp:extent cx="5039989" cy="5410071"/>
             <wp:docPr id="3" name="Picture 3"/>
             <wp:cNvGraphicFramePr>
               <a:graphicFrameLocks noChangeAspect="1"/>
@@ -1795,7 +1321,7 @@
                   <pic:spPr>
                     <a:xfrm>
                       <a:off x="0" y="0"/>
-                      <a:ext cx="5029200" cy="5398490"/>
+                      <a:ext cx="5039989" cy="5410071"/>
                     </a:xfrm>
                     <a:prstGeom prst="rect"/>
                   </pic:spPr>
@@ -1808,95 +1334,71 @@
     </w:p>
     <w:p>
       <w:pPr>
-        <w:spacing w:before="20" w:after="120"/>
+        <w:spacing w:before="0" w:after="280"/>
+        <w:jc w:val="left"/>
       </w:pPr>
       <w:r>
         <w:rPr>
-          <w:b/>
-          <w:color w:val="57606A"/>
+          <w:rFonts w:ascii="Arial" w:hAnsi="Arial"/>
           <w:sz w:val="19"/>
         </w:rPr>
-        <w:t xml:space="preserve">   Fonte: </w:t>
-      </w:r>
-      <w:r>
-        <w:rPr>
-          <w:i/>
-          <w:color w:val="57606A"/>
-          <w:sz w:val="19"/>
-        </w:rPr>
-        <w:t>NIELSEN (1993); BARBOSA et al. (2021), Cap. 11, Seção 11.7.5 (Consolidação e Relato dos Resultados), p. 303.</w:t>
+        <w:t>Fonte: NIELSEN (1993); BARBOSA et al. (2021), Cap. 11, Seção 11.7.5 (Consolidação e Relato dos Resultados), p. 303.</w:t>
       </w:r>
     </w:p>
     <w:p>
       <w:pPr>
         <w:keepNext/>
-        <w:spacing w:before="160" w:after="40"/>
+        <w:spacing w:before="80" w:after="80"/>
+        <w:jc w:val="left"/>
       </w:pPr>
       <w:r>
         <w:rPr>
+          <w:rFonts w:ascii="Arial" w:hAnsi="Arial"/>
           <w:b/>
           <w:sz w:val="21"/>
         </w:rPr>
-        <w:t xml:space="preserve">27) </w:t>
-      </w:r>
-      <w:r>
-        <w:rPr>
-          <w:sz w:val="21"/>
-        </w:rPr>
-        <w:t>Rastreabilidade entre Amostra de Participantes e Elenco de Personas: Os planejamentos de avaliação garantem que os participantes recrutados (USR-06 a USR-09 em tarefas, e USR-10 a USR-13 em storyboards) correspondam explicitamente às características sociodemográficas e aos hábitos de estudo das personas mapeadas (PER-01 a PER-04)?</w:t>
+        <w:t>27) Rastreabilidade entre Amostra de Participantes e Elenco de Personas: Os planejamentos de avaliação garantem que os participantes recrutados (USR-06 a USR-09 em tarefas, e USR-10 a USR-13 em storyboards) correspondam explicitamente às características sociodemográficas e aos hábitos de estudo das personas mapeadas (PER-01 a PER-04)? (Autor: Leonardo da Silva Lopes Júnior)</w:t>
       </w:r>
     </w:p>
     <w:p>
       <w:pPr>
         <w:keepNext/>
-        <w:spacing w:before="40" w:after="40"/>
+        <w:spacing w:before="0" w:after="80"/>
+        <w:jc w:val="center"/>
       </w:pPr>
       <w:r>
         <w:rPr>
-          <w:b/>
-          <w:color w:val="333333"/>
+          <w:rFonts w:ascii="Arial" w:hAnsi="Arial"/>
           <w:sz w:val="20"/>
         </w:rPr>
-        <w:t xml:space="preserve">   (   ) Sim          (   ) Não          (   ) Incompleto</w:t>
+        <w:t>(  ) Conforme          (  ) Não conforme          (  ) Não se aplica</w:t>
       </w:r>
     </w:p>
     <w:p>
       <w:pPr>
         <w:keepNext/>
-        <w:spacing w:before="20" w:after="40"/>
+        <w:spacing w:before="0" w:after="40"/>
+        <w:jc w:val="left"/>
       </w:pPr>
       <w:r>
         <w:rPr>
-          <w:i/>
-          <w:sz w:val="19"/>
+          <w:rFonts w:ascii="Arial" w:hAnsi="Arial"/>
+          <w:b/>
+          <w:sz w:val="20"/>
         </w:rPr>
-        <w:t xml:space="preserve">   Autor do Item: Leonardo da Silva Lopes Júnior</w:t>
+        <w:t>Foto:</w:t>
       </w:r>
     </w:p>
     <w:p>
       <w:pPr>
         <w:keepNext/>
-        <w:spacing w:before="80" w:after="40"/>
-        <w:jc w:val="center"/>
-      </w:pPr>
-      <w:r>
-        <w:rPr>
-          <w:b/>
-          <w:sz w:val="19"/>
-        </w:rPr>
-        <w:t>Figura 4: Referência Bibliográfica — Coleta de Dados Sociodemográficos e Perfil de Usuário (BARBOSA et al., 2021, p. 147)</w:t>
-      </w:r>
-    </w:p>
-    <w:p>
-      <w:pPr>
-        <w:keepNext/>
-        <w:spacing w:before="40" w:after="40"/>
+        <w:spacing w:before="0" w:after="40"/>
         <w:jc w:val="center"/>
       </w:pPr>
       <w:r>
         <w:drawing>
           <wp:inline xmlns:a="http://schemas.openxmlformats.org/drawingml/2006/main" xmlns:pic="http://schemas.openxmlformats.org/drawingml/2006/picture">
-            <wp:extent cx="5029200" cy="4390088"/>
+            <wp:extent cx="5039989" cy="4399506"/>
             <wp:docPr id="4" name="Picture 4"/>
             <wp:cNvGraphicFramePr>
               <a:graphicFrameLocks noChangeAspect="1"/>
@@ -1917,7 +1419,7 @@
                   <pic:spPr>
                     <a:xfrm>
                       <a:off x="0" y="0"/>
-                      <a:ext cx="5029200" cy="4390088"/>
+                      <a:ext cx="5039989" cy="4399506"/>
                     </a:xfrm>
                     <a:prstGeom prst="rect"/>
                   </pic:spPr>
@@ -1930,28 +1432,20 @@
     </w:p>
     <w:p>
       <w:pPr>
-        <w:spacing w:before="20" w:after="120"/>
+        <w:spacing w:before="0" w:after="280"/>
+        <w:jc w:val="left"/>
       </w:pPr>
       <w:r>
         <w:rPr>
-          <w:b/>
-          <w:color w:val="57606A"/>
+          <w:rFonts w:ascii="Arial" w:hAnsi="Arial"/>
           <w:sz w:val="19"/>
         </w:rPr>
-        <w:t xml:space="preserve">   Fonte: </w:t>
-      </w:r>
-      <w:r>
-        <w:rPr>
-          <w:i/>
-          <w:color w:val="57606A"/>
-          <w:sz w:val="19"/>
-        </w:rPr>
-        <w:t>BARBOSA et al. (2021), Cap. 8, Seção 8.2 (Personas), p. 180; COOPER (1999).</w:t>
+        <w:t>Fonte: BARBOSA et al. (2021), Cap. 8, Seção 8.2 (Personas), p. 180; COOPER (1999).</w:t>
       </w:r>
     </w:p>
     <w:sectPr>
       <w:pgSz w:w="12240" w:h="15840"/>
-      <w:pgMar w:top="1138" w:right="1138" w:bottom="1138" w:left="1138" w:header="720" w:footer="720" w:gutter="0"/>
+      <w:pgMar w:top="1134" w:right="1134" w:bottom="1134" w:left="1134" w:header="720" w:footer="720" w:gutter="0"/>
       <w:cols w:space="720"/>
       <w:docGrid w:linePitch="360"/>
     </w:sectPr>
@@ -2322,11 +1816,6 @@
     <w:name w:val="Normal"/>
     <w:qFormat/>
     <w:rsid w:val="00FC693F"/>
-    <w:rPr>
-      <w:rFonts w:ascii="Arial" w:hAnsi="Arial"/>
-      <w:color w:val="24292F"/>
-      <w:sz w:val="22"/>
-    </w:rPr>
   </w:style>
   <w:style w:type="paragraph" w:styleId="Header">
     <w:name w:val="header"/>

</xml_diff>